<commit_message>
Redesign Bayna logo: the b whose counter is an eye (v3)
The symbol is now a lowercase b with an almond eye and a lime iris
(باينة = "it shows"). In the primary lockup the symbol is the first
letter of "bayna". Regenerated the whole kit with it: logos in every
format, icons, patterns (lime iris motif), social, banners, print,
videos (eye opens and blinks), mockups, ready-to-use pack, and the
EN + FR guidelines with new symbol and construction pages.

Co-Authored-By: Claude Opus 5.5 <noreply@anthropic.com>
Claude-Session: https://claude.ai/code/session_01VSyU3K2edW3v2Qfo5sYkJT
</commit_message>
<xml_diff>
--- a/brand/bayna-agency/print/letterhead/Bayna-letterhead-A4-EDITABLE.docx
+++ b/brand/bayna-agency/print/letterhead/Bayna-letterhead-A4-EDITABLE.docx
@@ -105,7 +105,7 @@
           <w:r>
             <w:drawing>
               <wp:inline xmlns:a="http://schemas.openxmlformats.org/drawingml/2006/main" xmlns:pic="http://schemas.openxmlformats.org/drawingml/2006/picture">
-                <wp:extent cx="1944000" cy="566190"/>
+                <wp:extent cx="1944000" cy="575910"/>
                 <wp:docPr id="1" name="Picture 1"/>
                 <wp:cNvGraphicFramePr>
                   <a:graphicFrameLocks noChangeAspect="1"/>
@@ -126,7 +126,7 @@
                       <pic:spPr>
                         <a:xfrm>
                           <a:off x="0" y="0"/>
-                          <a:ext cx="1944000" cy="566190"/>
+                          <a:ext cx="1944000" cy="575910"/>
                         </a:xfrm>
                         <a:prstGeom prst="rect"/>
                       </pic:spPr>

</xml_diff>